<commit_message>
Organik belge paketi: GOTS/OCS prosedür-talimat-politika, 8 form, alan tabelaları, organik klasör dizini
Co-Authored-By: Claude Sonnet 5.5 <noreply@anthropic.com>
Claude-Session: https://claude.ai/code/session_01J6foNXTwf1dGzDjULYpfrk
</commit_message>
<xml_diff>
--- a/prosedurler/EMS.OR.POL.21.01. Organic Content Policy.docx
+++ b/prosedurler/EMS.OR.POL.21.01. Organic Content Policy.docx
@@ -32,7 +32,7 @@
           <w:sz w:val="24"/>
           <w:szCs w:val="24"/>
         </w:rPr>
-        <w:t xml:space="preserve">This policy sets out the commitment of Eroglu Knitting (EMS) to process, label and sell products containing organically grown fibres in line with the Organic Content Standard (OCS), to protect the integrity of organic material from receipt to shipment and to give our customers reliable organic claims.</w:t>
+        <w:t xml:space="preserve">This policy sets out the commitment of Eroglu Knitting (EMS) to process, label and sell products containing organically grown fibres in line with the Global Organic Textile Standard (GOTS) and the Organic Content Standard (OCS), to protect the integrity of organic material from receipt to shipment and to give our customers reliable organic claims.</w:t>
       </w:r>
     </w:p>
     <w:p>
@@ -89,7 +89,7 @@
           <w:sz w:val="24"/>
           <w:szCs w:val="24"/>
         </w:rPr>
-        <w:t xml:space="preserve">• All receipt, storage, knitting, dyeing and finishing, cutting, sewing, printing, embroidery, packing and shipment of OCS 100 and OCS Blended products,</w:t>
+        <w:t xml:space="preserve">• All receipt, storage, knitting, dyeing and finishing, cutting, sewing, printing, embroidery, packing and shipment of GOTS (organic and made with organic) and OCS 100 / OCS Blended products,</w:t>
       </w:r>
     </w:p>
     <w:p>
@@ -121,7 +121,7 @@
           <w:sz w:val="24"/>
           <w:szCs w:val="24"/>
         </w:rPr>
-        <w:t xml:space="preserve">• All sales documents, labels and claims related to organic content.</w:t>
+        <w:t xml:space="preserve">• The visually identified organic production areas (areas 1 to 15) and the chemical storage, waste and wastewater activities that support them,</w:t>
       </w:r>
     </w:p>
     <w:p>
@@ -137,7 +137,7 @@
           <w:sz w:val="24"/>
           <w:szCs w:val="24"/>
         </w:rPr>
-        <w:t xml:space="preserve">It applies to all EMS employees involved in these activities.</w:t>
+        <w:t xml:space="preserve">• All sales documents, labels and claims related to organic content.</w:t>
       </w:r>
     </w:p>
     <w:p>
@@ -147,6 +147,22 @@
         <w:ind w:left="709" w:right="0"/>
         <w:jc w:val="both"/>
       </w:pPr>
+      <w:r>
+        <w:rPr>
+          <w:rFonts w:ascii="Calibri" w:hAnsi="Calibri" w:cs="Arial"/>
+          <w:sz w:val="24"/>
+          <w:szCs w:val="24"/>
+        </w:rPr>
+        <w:t xml:space="preserve">It applies to all EMS employees involved in these activities.</w:t>
+      </w:r>
+    </w:p>
+    <w:p>
+      <w:pPr>
+        <w:pStyle w:val="ListeParagraf"/>
+        <w:spacing w:after="80"/>
+        <w:ind w:left="709" w:right="0"/>
+        <w:jc w:val="both"/>
+      </w:pPr>
     </w:p>
     <w:p>
       <w:pPr>
@@ -222,7 +238,7 @@
           <w:sz w:val="24"/>
           <w:szCs w:val="24"/>
         </w:rPr>
-        <w:t xml:space="preserve">OCS Coordinator (Sustainability / Quality):</w:t>
+        <w:t xml:space="preserve">OCS / GOTS Coordinator (Sustainability / Quality):</w:t>
       </w:r>
       <w:r>
         <w:rPr>
@@ -290,15 +306,15 @@
           <w:sz w:val="24"/>
           <w:szCs w:val="24"/>
         </w:rPr>
-        <w:t xml:space="preserve">Purchasing and Sales:</w:t>
-      </w:r>
-      <w:r>
-        <w:rPr>
-          <w:rFonts w:ascii="Calibri" w:hAnsi="Calibri" w:cs="Arial"/>
-          <w:sz w:val="24"/>
-          <w:szCs w:val="24"/>
-        </w:rPr>
-        <w:t xml:space="preserve"> Buy organic material only from certified suppliers and make organic claims only for certified products.</w:t>
+        <w:t xml:space="preserve">Area Supervisors:</w:t>
+      </w:r>
+      <w:r>
+        <w:rPr>
+          <w:rFonts w:ascii="Calibri" w:hAnsi="Calibri" w:cs="Arial"/>
+          <w:sz w:val="24"/>
+          <w:szCs w:val="24"/>
+        </w:rPr>
+        <w:t xml:space="preserve"> Keep their organic area marked, clean and free of conventional material, and complete the daily area checklist.</w:t>
       </w:r>
     </w:p>
     <w:p>
@@ -324,15 +340,15 @@
           <w:sz w:val="24"/>
           <w:szCs w:val="24"/>
         </w:rPr>
-        <w:t xml:space="preserve">Employees:</w:t>
-      </w:r>
-      <w:r>
-        <w:rPr>
-          <w:rFonts w:ascii="Calibri" w:hAnsi="Calibri" w:cs="Arial"/>
-          <w:sz w:val="24"/>
-          <w:szCs w:val="24"/>
-        </w:rPr>
-        <w:t xml:space="preserve"> Follow the segregation and labelling rules and report any risk of mixing.</w:t>
+        <w:t xml:space="preserve">Purchasing and Sales:</w:t>
+      </w:r>
+      <w:r>
+        <w:rPr>
+          <w:rFonts w:ascii="Calibri" w:hAnsi="Calibri" w:cs="Arial"/>
+          <w:sz w:val="24"/>
+          <w:szCs w:val="24"/>
+        </w:rPr>
+        <w:t xml:space="preserve"> Buy organic material only from certified suppliers and make organic claims only for certified products.</w:t>
       </w:r>
     </w:p>
     <w:p>
@@ -342,6 +358,40 @@
         <w:ind w:left="709" w:right="0"/>
         <w:jc w:val="both"/>
       </w:pPr>
+      <w:r>
+        <w:rPr>
+          <w:rFonts w:ascii="Calibri" w:hAnsi="Calibri" w:cs="Arial"/>
+          <w:sz w:val="24"/>
+          <w:szCs w:val="24"/>
+        </w:rPr>
+        <w:t xml:space="preserve">• </w:t>
+      </w:r>
+      <w:r>
+        <w:rPr>
+          <w:rFonts w:ascii="Calibri" w:hAnsi="Calibri" w:cs="Arial"/>
+          <w:b/>
+          <w:bCs/>
+          <w:sz w:val="24"/>
+          <w:szCs w:val="24"/>
+        </w:rPr>
+        <w:t xml:space="preserve">Employees:</w:t>
+      </w:r>
+      <w:r>
+        <w:rPr>
+          <w:rFonts w:ascii="Calibri" w:hAnsi="Calibri" w:cs="Arial"/>
+          <w:sz w:val="24"/>
+          <w:szCs w:val="24"/>
+        </w:rPr>
+        <w:t xml:space="preserve"> Follow the segregation and labelling rules and report any risk of mixing.</w:t>
+      </w:r>
+    </w:p>
+    <w:p>
+      <w:pPr>
+        <w:pStyle w:val="ListeParagraf"/>
+        <w:spacing w:after="80"/>
+        <w:ind w:left="709" w:right="0"/>
+        <w:jc w:val="both"/>
+      </w:pPr>
     </w:p>
     <w:p>
       <w:pPr>
@@ -494,6 +544,108 @@
           <w:szCs w:val="24"/>
         </w:rPr>
         <w:t xml:space="preserve"> The certificate showing that EMS is certified for the listed processes and product categories.</w:t>
+      </w:r>
+    </w:p>
+    <w:p>
+      <w:pPr>
+        <w:pStyle w:val="ListeParagraf"/>
+        <w:spacing w:after="80"/>
+        <w:ind w:left="709" w:right="0"/>
+        <w:jc w:val="both"/>
+      </w:pPr>
+      <w:r>
+        <w:rPr>
+          <w:rFonts w:ascii="Calibri" w:hAnsi="Calibri" w:cs="Arial"/>
+          <w:sz w:val="24"/>
+          <w:szCs w:val="24"/>
+        </w:rPr>
+        <w:t xml:space="preserve">• </w:t>
+      </w:r>
+      <w:r>
+        <w:rPr>
+          <w:rFonts w:ascii="Calibri" w:hAnsi="Calibri" w:cs="Arial"/>
+          <w:b/>
+          <w:bCs/>
+          <w:sz w:val="24"/>
+          <w:szCs w:val="24"/>
+        </w:rPr>
+        <w:t xml:space="preserve">GOTS (Global Organic Textile Standard):</w:t>
+      </w:r>
+      <w:r>
+        <w:rPr>
+          <w:rFonts w:ascii="Calibri" w:hAnsi="Calibri" w:cs="Arial"/>
+          <w:sz w:val="24"/>
+          <w:szCs w:val="24"/>
+        </w:rPr>
+        <w:t xml:space="preserve"> The leading processing standard for textiles made from organic fibres. It covers the whole supply chain: organic fibre status and traceability, environmental criteria (approved chemical inputs, wastewater treatment, waste handling) and social criteria.</w:t>
+      </w:r>
+    </w:p>
+    <w:p>
+      <w:pPr>
+        <w:pStyle w:val="ListeParagraf"/>
+        <w:spacing w:after="80"/>
+        <w:ind w:left="709" w:right="0"/>
+        <w:jc w:val="both"/>
+      </w:pPr>
+      <w:r>
+        <w:rPr>
+          <w:rFonts w:ascii="Calibri" w:hAnsi="Calibri" w:cs="Arial"/>
+          <w:sz w:val="24"/>
+          <w:szCs w:val="24"/>
+        </w:rPr>
+        <w:t xml:space="preserve">• </w:t>
+      </w:r>
+      <w:r>
+        <w:rPr>
+          <w:rFonts w:ascii="Calibri" w:hAnsi="Calibri" w:cs="Arial"/>
+          <w:b/>
+          <w:bCs/>
+          <w:sz w:val="24"/>
+          <w:szCs w:val="24"/>
+        </w:rPr>
+        <w:t xml:space="preserve">GOTS Label Grades:</w:t>
+      </w:r>
+      <w:r>
+        <w:rPr>
+          <w:rFonts w:ascii="Calibri" w:hAnsi="Calibri" w:cs="Arial"/>
+          <w:sz w:val="24"/>
+          <w:szCs w:val="24"/>
+        </w:rPr>
+        <w:t xml:space="preserve"> “Organic” for products with at least 95% certified organic fibres, and “Made with organic materials” for products with at least 70% certified organic fibres, in each case within the limits of the version of the standard in force.</w:t>
+      </w:r>
+    </w:p>
+    <w:p>
+      <w:pPr>
+        <w:pStyle w:val="ListeParagraf"/>
+        <w:spacing w:after="80"/>
+        <w:ind w:left="709" w:right="0"/>
+        <w:jc w:val="both"/>
+      </w:pPr>
+      <w:r>
+        <w:rPr>
+          <w:rFonts w:ascii="Calibri" w:hAnsi="Calibri" w:cs="Arial"/>
+          <w:sz w:val="24"/>
+          <w:szCs w:val="24"/>
+        </w:rPr>
+        <w:t xml:space="preserve">• </w:t>
+      </w:r>
+      <w:r>
+        <w:rPr>
+          <w:rFonts w:ascii="Calibri" w:hAnsi="Calibri" w:cs="Arial"/>
+          <w:b/>
+          <w:bCs/>
+          <w:sz w:val="24"/>
+          <w:szCs w:val="24"/>
+        </w:rPr>
+        <w:t xml:space="preserve">Organic Production Area:</w:t>
+      </w:r>
+      <w:r>
+        <w:rPr>
+          <w:rFonts w:ascii="Calibri" w:hAnsi="Calibri" w:cs="Arial"/>
+          <w:sz w:val="24"/>
+          <w:szCs w:val="24"/>
+        </w:rPr>
+        <w:t xml:space="preserve"> A physically defined and visibly marked area where organic material is received, stored, processed or shipped, identified by the colour code in EMS.OR.PRO.21.02.</w:t>
       </w:r>
     </w:p>
     <w:p>
@@ -684,7 +836,7 @@
           <w:sz w:val="24"/>
           <w:szCs w:val="24"/>
         </w:rPr>
-        <w:t xml:space="preserve">Train all relevant employees on OCS requirements and keep OCS records for at least five years.</w:t>
+        <w:t xml:space="preserve">Apply the GOTS environmental and social criteria: use only GOTS-approved chemical inputs, treat wet-processing wastewater, segregate waste and respect the social requirements of the standard.</w:t>
       </w:r>
     </w:p>
     <w:p>
@@ -703,6 +855,63 @@
           <w:sz w:val="24"/>
           <w:szCs w:val="24"/>
         </w:rPr>
+        <w:t xml:space="preserve">Keep every organic production area visibly identified by the colour code (green organic, blue conventional, yellow holding or quarantine, red non-conforming) and inspected every day.</w:t>
+      </w:r>
+    </w:p>
+    <w:p>
+      <w:pPr>
+        <w:pStyle w:val="ListeParagraf"/>
+        <w:numPr>
+          <w:ilvl w:val="0"/>
+          <w:numId w:val="1"/>
+        </w:numPr>
+        <w:spacing w:after="60"/>
+        <w:jc w:val="both"/>
+      </w:pPr>
+      <w:r>
+        <w:rPr>
+          <w:rFonts w:ascii="Calibri" w:hAnsi="Calibri" w:cs="Arial"/>
+          <w:sz w:val="24"/>
+          <w:szCs w:val="24"/>
+        </w:rPr>
+        <w:t xml:space="preserve">Obtain the approval of the certification body before any organic logo, licence number or claim is printed on a label, tag or carton.</w:t>
+      </w:r>
+    </w:p>
+    <w:p>
+      <w:pPr>
+        <w:pStyle w:val="ListeParagraf"/>
+        <w:numPr>
+          <w:ilvl w:val="0"/>
+          <w:numId w:val="1"/>
+        </w:numPr>
+        <w:spacing w:after="60"/>
+        <w:jc w:val="both"/>
+      </w:pPr>
+      <w:r>
+        <w:rPr>
+          <w:rFonts w:ascii="Calibri" w:hAnsi="Calibri" w:cs="Arial"/>
+          <w:sz w:val="24"/>
+          <w:szCs w:val="24"/>
+        </w:rPr>
+        <w:t xml:space="preserve">Train all relevant employees on OCS requirements and keep OCS records for at least five years.</w:t>
+      </w:r>
+    </w:p>
+    <w:p>
+      <w:pPr>
+        <w:pStyle w:val="ListeParagraf"/>
+        <w:numPr>
+          <w:ilvl w:val="0"/>
+          <w:numId w:val="1"/>
+        </w:numPr>
+        <w:spacing w:after="60"/>
+        <w:jc w:val="both"/>
+      </w:pPr>
+      <w:r>
+        <w:rPr>
+          <w:rFonts w:ascii="Calibri" w:hAnsi="Calibri" w:cs="Arial"/>
+          <w:sz w:val="24"/>
+          <w:szCs w:val="24"/>
+        </w:rPr>
         <w:t xml:space="preserve">Never make false or misleading organic claims, and report any nonconformity transparently to the certification body and customers.</w:t>
       </w:r>
     </w:p>
@@ -748,9 +957,13 @@
       </w:r>
     </w:p>
     <w:p>
-      <w:pPr>
-        <w:pStyle w:val="ListeParagraf"/>
-        <w:pageBreakBefore/>
+      <w:r>
+        <w:br w:type="page"/>
+      </w:r>
+    </w:p>
+    <w:p>
+      <w:pPr>
+        <w:pStyle w:val="ListeParagraf"/>
         <w:bidi/>
         <w:spacing w:before="120" w:after="60"/>
         <w:ind w:left="0" w:right="709"/>
@@ -782,7 +995,7 @@
           <w:sz w:val="24"/>
           <w:szCs w:val="24"/>
         </w:rPr>
-        <w:t xml:space="preserve">تحدد هذه السياسة التزام شركة إيروغلو للتريكو (EMS) بمعالجة المنتجات المحتوية على ألياف مزروعة عضويًا وتوسيمها وبيعها وفقًا لمعيار المحتوى العضوي (OCS)، وبحماية سلامة المواد العضوية من الاستلام حتى الشحن، وبتقديم ادعاءات عضوية موثوقة لعملائنا.</w:t>
+        <w:t xml:space="preserve">تحدد هذه السياسة التزام شركة إيروغلو للتريكو (EMS) بمعالجة المنتجات المحتوية على ألياف مزروعة عضويًا وتوسيمها وبيعها وفقًا للمعيار العالمي للمنسوجات العضوية (GOTS) ومعيار المحتوى العضوي (OCS)، وبحماية سلامة المواد العضوية من الاستلام حتى الشحن، وبتقديم ادعاءات عضوية موثوقة لعملائنا.</w:t>
       </w:r>
     </w:p>
     <w:p>
@@ -846,7 +1059,7 @@
           <w:sz w:val="24"/>
           <w:szCs w:val="24"/>
         </w:rPr>
-        <w:t xml:space="preserve">• جميع عمليات الاستلام والتخزين والتريكو والصباغة والتجهيز والقص والخياطة والطباعة والتطريز والتعبئة والشحن لمنتجات OCS 100 وOCS Blended،</w:t>
+        <w:t xml:space="preserve">• جميع عمليات الاستلام والتخزين والتريكو والصباغة والتجهيز والقص والخياطة والطباعة والتطريز والتعبئة والشحن لمنتجات GOTS (عضوي ومصنوع من مواد عضوية) وOCS 100 وOCS Blended،</w:t>
       </w:r>
     </w:p>
     <w:p>
@@ -882,7 +1095,7 @@
           <w:sz w:val="24"/>
           <w:szCs w:val="24"/>
         </w:rPr>
-        <w:t xml:space="preserve">• جميع وثائق المبيعات والملصقات والادعاءات المتعلقة بالمحتوى العضوي.</w:t>
+        <w:t xml:space="preserve">• مناطق الإنتاج العضوي المميزة بصريًا (المناطق من 1 إلى 15) وأنشطة تخزين المواد الكيميائية والنفايات ومياه الصرف الداعمة لها،</w:t>
       </w:r>
     </w:p>
     <w:p>
@@ -900,7 +1113,7 @@
           <w:sz w:val="24"/>
           <w:szCs w:val="24"/>
         </w:rPr>
-        <w:t xml:space="preserve">وتنطبق على جميع موظفي EMS المشاركين في هذه الأنشطة.</w:t>
+        <w:t xml:space="preserve">• جميع وثائق المبيعات والملصقات والادعاءات المتعلقة بالمحتوى العضوي.</w:t>
       </w:r>
     </w:p>
     <w:p>
@@ -911,6 +1124,24 @@
         <w:ind w:left="0" w:right="709"/>
         <w:jc w:val="both"/>
       </w:pPr>
+      <w:r>
+        <w:rPr>
+          <w:rFonts w:ascii="Calibri" w:hAnsi="Calibri" w:cs="Arial"/>
+          <w:rtl/>
+          <w:sz w:val="24"/>
+          <w:szCs w:val="24"/>
+        </w:rPr>
+        <w:t xml:space="preserve">وتنطبق على جميع موظفي EMS المشاركين في هذه الأنشطة.</w:t>
+      </w:r>
+    </w:p>
+    <w:p>
+      <w:pPr>
+        <w:pStyle w:val="ListeParagraf"/>
+        <w:bidi/>
+        <w:spacing w:after="80"/>
+        <w:ind w:left="0" w:right="709"/>
+        <w:jc w:val="both"/>
+      </w:pPr>
     </w:p>
     <w:p>
       <w:pPr>
@@ -995,7 +1226,7 @@
           <w:sz w:val="24"/>
           <w:szCs w:val="24"/>
         </w:rPr>
-        <w:t xml:space="preserve">منسق OCS (الاستدامة / الجودة):</w:t>
+        <w:t xml:space="preserve">منسق OCS / GOTS (الاستدامة / الجودة):</w:t>
       </w:r>
       <w:r>
         <w:rPr>
@@ -1071,16 +1302,16 @@
           <w:sz w:val="24"/>
           <w:szCs w:val="24"/>
         </w:rPr>
-        <w:t xml:space="preserve">المشتريات والمبيعات:</w:t>
-      </w:r>
-      <w:r>
-        <w:rPr>
-          <w:rFonts w:ascii="Calibri" w:hAnsi="Calibri" w:cs="Arial"/>
-          <w:rtl/>
-          <w:sz w:val="24"/>
-          <w:szCs w:val="24"/>
-        </w:rPr>
-        <w:t xml:space="preserve"> يشترون المواد العضوية من الموردين المعتمدين فقط، ولا يقدمون ادعاءات عضوية إلا للمنتجات المعتمدة.</w:t>
+        <w:t xml:space="preserve">مشرفو المناطق:</w:t>
+      </w:r>
+      <w:r>
+        <w:rPr>
+          <w:rFonts w:ascii="Calibri" w:hAnsi="Calibri" w:cs="Arial"/>
+          <w:rtl/>
+          <w:sz w:val="24"/>
+          <w:szCs w:val="24"/>
+        </w:rPr>
+        <w:t xml:space="preserve"> يحافظون على تمييز منطقتهم العضوية ونظافتها وخلوها من المواد التقليدية، ويستكملون قائمة الفحص اليومية للمنطقة.</w:t>
       </w:r>
     </w:p>
     <w:p>
@@ -1109,16 +1340,16 @@
           <w:sz w:val="24"/>
           <w:szCs w:val="24"/>
         </w:rPr>
-        <w:t xml:space="preserve">الموظفون:</w:t>
-      </w:r>
-      <w:r>
-        <w:rPr>
-          <w:rFonts w:ascii="Calibri" w:hAnsi="Calibri" w:cs="Arial"/>
-          <w:rtl/>
-          <w:sz w:val="24"/>
-          <w:szCs w:val="24"/>
-        </w:rPr>
-        <w:t xml:space="preserve"> يتبعون قواعد الفصل والتوسيم ويبلغون عن أي خطر للخلط.</w:t>
+        <w:t xml:space="preserve">المشتريات والمبيعات:</w:t>
+      </w:r>
+      <w:r>
+        <w:rPr>
+          <w:rFonts w:ascii="Calibri" w:hAnsi="Calibri" w:cs="Arial"/>
+          <w:rtl/>
+          <w:sz w:val="24"/>
+          <w:szCs w:val="24"/>
+        </w:rPr>
+        <w:t xml:space="preserve"> يشترون المواد العضوية من الموردين المعتمدين فقط، ولا يقدمون ادعاءات عضوية إلا للمنتجات المعتمدة.</w:t>
       </w:r>
     </w:p>
     <w:p>
@@ -1129,6 +1360,44 @@
         <w:ind w:left="0" w:right="709"/>
         <w:jc w:val="both"/>
       </w:pPr>
+      <w:r>
+        <w:rPr>
+          <w:rFonts w:ascii="Calibri" w:hAnsi="Calibri" w:cs="Arial"/>
+          <w:rtl/>
+          <w:sz w:val="24"/>
+          <w:szCs w:val="24"/>
+        </w:rPr>
+        <w:t xml:space="preserve">• </w:t>
+      </w:r>
+      <w:r>
+        <w:rPr>
+          <w:rFonts w:ascii="Calibri" w:hAnsi="Calibri" w:cs="Arial"/>
+          <w:b/>
+          <w:bCs/>
+          <w:rtl/>
+          <w:sz w:val="24"/>
+          <w:szCs w:val="24"/>
+        </w:rPr>
+        <w:t xml:space="preserve">الموظفون:</w:t>
+      </w:r>
+      <w:r>
+        <w:rPr>
+          <w:rFonts w:ascii="Calibri" w:hAnsi="Calibri" w:cs="Arial"/>
+          <w:rtl/>
+          <w:sz w:val="24"/>
+          <w:szCs w:val="24"/>
+        </w:rPr>
+        <w:t xml:space="preserve"> يتبعون قواعد الفصل والتوسيم ويبلغون عن أي خطر للخلط.</w:t>
+      </w:r>
+    </w:p>
+    <w:p>
+      <w:pPr>
+        <w:pStyle w:val="ListeParagraf"/>
+        <w:bidi/>
+        <w:spacing w:after="80"/>
+        <w:ind w:left="0" w:right="709"/>
+        <w:jc w:val="both"/>
+      </w:pPr>
     </w:p>
     <w:p>
       <w:pPr>
@@ -1299,6 +1568,120 @@
           <w:szCs w:val="24"/>
         </w:rPr>
         <w:t xml:space="preserve"> الشهادة التي تبين أن EMS معتمدة للعمليات وفئات المنتجات المدرجة فيها.</w:t>
+      </w:r>
+    </w:p>
+    <w:p>
+      <w:pPr>
+        <w:pStyle w:val="ListeParagraf"/>
+        <w:bidi/>
+        <w:spacing w:after="80"/>
+        <w:ind w:left="0" w:right="709"/>
+        <w:jc w:val="both"/>
+      </w:pPr>
+      <w:r>
+        <w:rPr>
+          <w:rFonts w:ascii="Calibri" w:hAnsi="Calibri" w:cs="Arial"/>
+          <w:rtl/>
+          <w:sz w:val="24"/>
+          <w:szCs w:val="24"/>
+        </w:rPr>
+        <w:t xml:space="preserve">• </w:t>
+      </w:r>
+      <w:r>
+        <w:rPr>
+          <w:rFonts w:ascii="Calibri" w:hAnsi="Calibri" w:cs="Arial"/>
+          <w:b/>
+          <w:bCs/>
+          <w:rtl/>
+          <w:sz w:val="24"/>
+          <w:szCs w:val="24"/>
+        </w:rPr>
+        <w:t xml:space="preserve">المعيار العالمي للمنسوجات العضوية (GOTS):</w:t>
+      </w:r>
+      <w:r>
+        <w:rPr>
+          <w:rFonts w:ascii="Calibri" w:hAnsi="Calibri" w:cs="Arial"/>
+          <w:rtl/>
+          <w:sz w:val="24"/>
+          <w:szCs w:val="24"/>
+        </w:rPr>
+        <w:t xml:space="preserve"> المعيار الرائد لمعالجة المنسوجات المصنوعة من ألياف عضوية. ويغطي سلسلة التوريد كاملة: وضع الألياف العضوية والتتبع، والمعايير البيئية (المدخلات الكيميائية المعتمدة ومعالجة مياه الصرف وإدارة النفايات)، والمعايير الاجتماعية.</w:t>
+      </w:r>
+    </w:p>
+    <w:p>
+      <w:pPr>
+        <w:pStyle w:val="ListeParagraf"/>
+        <w:bidi/>
+        <w:spacing w:after="80"/>
+        <w:ind w:left="0" w:right="709"/>
+        <w:jc w:val="both"/>
+      </w:pPr>
+      <w:r>
+        <w:rPr>
+          <w:rFonts w:ascii="Calibri" w:hAnsi="Calibri" w:cs="Arial"/>
+          <w:rtl/>
+          <w:sz w:val="24"/>
+          <w:szCs w:val="24"/>
+        </w:rPr>
+        <w:t xml:space="preserve">• </w:t>
+      </w:r>
+      <w:r>
+        <w:rPr>
+          <w:rFonts w:ascii="Calibri" w:hAnsi="Calibri" w:cs="Arial"/>
+          <w:b/>
+          <w:bCs/>
+          <w:rtl/>
+          <w:sz w:val="24"/>
+          <w:szCs w:val="24"/>
+        </w:rPr>
+        <w:t xml:space="preserve">درجات توسيم GOTS:</w:t>
+      </w:r>
+      <w:r>
+        <w:rPr>
+          <w:rFonts w:ascii="Calibri" w:hAnsi="Calibri" w:cs="Arial"/>
+          <w:rtl/>
+          <w:sz w:val="24"/>
+          <w:szCs w:val="24"/>
+        </w:rPr>
+        <w:t xml:space="preserve"> «عضوي» للمنتجات التي تحتوي على 95% على الأقل من الألياف العضوية المعتمدة، و«مصنوع من مواد عضوية» للمنتجات التي تحتوي على 70% على الأقل من الألياف العضوية المعتمدة، وذلك ضمن حدود الإصدار الساري من المعيار.</w:t>
+      </w:r>
+    </w:p>
+    <w:p>
+      <w:pPr>
+        <w:pStyle w:val="ListeParagraf"/>
+        <w:bidi/>
+        <w:spacing w:after="80"/>
+        <w:ind w:left="0" w:right="709"/>
+        <w:jc w:val="both"/>
+      </w:pPr>
+      <w:r>
+        <w:rPr>
+          <w:rFonts w:ascii="Calibri" w:hAnsi="Calibri" w:cs="Arial"/>
+          <w:rtl/>
+          <w:sz w:val="24"/>
+          <w:szCs w:val="24"/>
+        </w:rPr>
+        <w:t xml:space="preserve">• </w:t>
+      </w:r>
+      <w:r>
+        <w:rPr>
+          <w:rFonts w:ascii="Calibri" w:hAnsi="Calibri" w:cs="Arial"/>
+          <w:b/>
+          <w:bCs/>
+          <w:rtl/>
+          <w:sz w:val="24"/>
+          <w:szCs w:val="24"/>
+        </w:rPr>
+        <w:t xml:space="preserve">منطقة الإنتاج العضوي:</w:t>
+      </w:r>
+      <w:r>
+        <w:rPr>
+          <w:rFonts w:ascii="Calibri" w:hAnsi="Calibri" w:cs="Arial"/>
+          <w:rtl/>
+          <w:sz w:val="24"/>
+          <w:szCs w:val="24"/>
+        </w:rPr>
+        <w:t xml:space="preserve"> منطقة محددة فعليًا ومعلّمة بوضوح تُستلم فيها المواد العضوية أو تُخزن أو تُعالج أو تُشحن، وتُميّز بنظام الألوان المحدد في EMS.OR.PRO.21.02.</w:t>
       </w:r>
     </w:p>
     <w:p>
@@ -1510,7 +1893,7 @@
           <w:sz w:val="24"/>
           <w:szCs w:val="24"/>
         </w:rPr>
-        <w:t xml:space="preserve">تدريب جميع الموظفين المعنيين على متطلبات OCS والاحتفاظ بسجلات OCS لمدة خمس سنوات على الأقل.</w:t>
+        <w:t xml:space="preserve">تطبيق المعايير البيئية والاجتماعية في GOTS: استخدام المدخلات الكيميائية المعتمدة من GOTS فقط، ومعالجة مياه الصرف الناتجة عن المعالجة الرطبة، وفصل النفايات، واحترام المتطلبات الاجتماعية للمعيار.</w:t>
       </w:r>
     </w:p>
     <w:p>
@@ -1531,6 +1914,69 @@
           <w:sz w:val="24"/>
           <w:szCs w:val="24"/>
         </w:rPr>
+        <w:t xml:space="preserve">إبقاء كل منطقة إنتاج عضوي مميزة بصريًا بنظام الألوان (أخضر عضوي، أزرق تقليدي، أصفر انتظار أو حجر، أحمر غير مطابق) وفحصها يوميًا.</w:t>
+      </w:r>
+    </w:p>
+    <w:p>
+      <w:pPr>
+        <w:pStyle w:val="ListeParagraf"/>
+        <w:numPr>
+          <w:ilvl w:val="0"/>
+          <w:numId w:val="1"/>
+        </w:numPr>
+        <w:bidi/>
+        <w:spacing w:after="60"/>
+        <w:jc w:val="both"/>
+      </w:pPr>
+      <w:r>
+        <w:rPr>
+          <w:rFonts w:ascii="Calibri" w:hAnsi="Calibri" w:cs="Arial"/>
+          <w:rtl/>
+          <w:sz w:val="24"/>
+          <w:szCs w:val="24"/>
+        </w:rPr>
+        <w:t xml:space="preserve">الحصول على موافقة جهة الاعتماد قبل طباعة أي شعار عضوي أو رقم ترخيص أو ادعاء على ملصق أو بطاقة أو كرتونة.</w:t>
+      </w:r>
+    </w:p>
+    <w:p>
+      <w:pPr>
+        <w:pStyle w:val="ListeParagraf"/>
+        <w:numPr>
+          <w:ilvl w:val="0"/>
+          <w:numId w:val="1"/>
+        </w:numPr>
+        <w:bidi/>
+        <w:spacing w:after="60"/>
+        <w:jc w:val="both"/>
+      </w:pPr>
+      <w:r>
+        <w:rPr>
+          <w:rFonts w:ascii="Calibri" w:hAnsi="Calibri" w:cs="Arial"/>
+          <w:rtl/>
+          <w:sz w:val="24"/>
+          <w:szCs w:val="24"/>
+        </w:rPr>
+        <w:t xml:space="preserve">تدريب جميع الموظفين المعنيين على متطلبات OCS والاحتفاظ بسجلات OCS لمدة خمس سنوات على الأقل.</w:t>
+      </w:r>
+    </w:p>
+    <w:p>
+      <w:pPr>
+        <w:pStyle w:val="ListeParagraf"/>
+        <w:numPr>
+          <w:ilvl w:val="0"/>
+          <w:numId w:val="1"/>
+        </w:numPr>
+        <w:bidi/>
+        <w:spacing w:after="60"/>
+        <w:jc w:val="both"/>
+      </w:pPr>
+      <w:r>
+        <w:rPr>
+          <w:rFonts w:ascii="Calibri" w:hAnsi="Calibri" w:cs="Arial"/>
+          <w:rtl/>
+          <w:sz w:val="24"/>
+          <w:szCs w:val="24"/>
+        </w:rPr>
         <w:t xml:space="preserve">عدم تقديم ادعاءات عضوية كاذبة أو مضللة أبدًا، والإبلاغ بشفافية عن أي عدم مطابقة إلى جهة الاعتماد والعملاء.</w:t>
       </w:r>
     </w:p>
@@ -1580,7 +2026,6 @@
         <w:t xml:space="preserve">تُراجع هذه السياسة سنويًا خلال اجتماع مراجعة الإدارة، أو قبل ذلك عند تغير معيار OCS أو متطلبات العملاء. ويتم إبلاغها لجميع الموظفين المعنيين والمقاولين من الباطن والموردين.</w:t>
       </w:r>
     </w:p>
-    <w:p/>
     <w:p>
       <w:pPr>
         <w:pStyle w:val="ListeParagraf"/>
@@ -2822,6 +3267,57 @@
     </w:tbl>
     <w:p>
       <w:pPr>
+        <w:pStyle w:val="ListeParagraf"/>
+        <w:spacing w:before="160" w:after="0"/>
+        <w:ind w:left="709"/>
+      </w:pPr>
+      <w:r>
+        <w:rPr>
+          <w:rFonts w:ascii="Calibri" w:hAnsi="Calibri" w:cs="Calibri"/>
+          <w:b/>
+          <w:bCs/>
+          <w:sz w:val="20"/>
+          <w:szCs w:val="20"/>
+        </w:rPr>
+        <w:t xml:space="preserve">Hazırlayan: OCS / GOTS Koordinatörü (Sürdürülebilirlik / Kalite)  ..........................</w:t>
+      </w:r>
+    </w:p>
+    <w:p>
+      <w:pPr>
+        <w:pStyle w:val="ListeParagraf"/>
+        <w:spacing w:before="40" w:after="0"/>
+        <w:ind w:left="709"/>
+      </w:pPr>
+      <w:r>
+        <w:rPr>
+          <w:rFonts w:ascii="Calibri" w:hAnsi="Calibri" w:cs="Calibri"/>
+          <w:b/>
+          <w:bCs/>
+          <w:sz w:val="20"/>
+          <w:szCs w:val="20"/>
+        </w:rPr>
+        <w:t xml:space="preserve">Kontrol: Üretim Müdürü  ..........................</w:t>
+      </w:r>
+    </w:p>
+    <w:p>
+      <w:pPr>
+        <w:pStyle w:val="ListeParagraf"/>
+        <w:spacing w:before="40" w:after="0"/>
+        <w:ind w:left="709"/>
+      </w:pPr>
+      <w:r>
+        <w:rPr>
+          <w:rFonts w:ascii="Calibri" w:hAnsi="Calibri" w:cs="Calibri"/>
+          <w:b/>
+          <w:bCs/>
+          <w:sz w:val="20"/>
+          <w:szCs w:val="20"/>
+        </w:rPr>
+        <w:t xml:space="preserve">Kalite Müdürü: ..........................    Fabrika Müdürü: ..........................</w:t>
+      </w:r>
+    </w:p>
+    <w:p>
+      <w:pPr>
         <w:spacing w:before="0" w:after="0" w:line="20" w:lineRule="exact"/>
         <w:rPr>
           <w:vanish/>
@@ -3362,7 +3858,7 @@
               <w:sz w:val="16"/>
               <w:szCs w:val="16"/>
             </w:rPr>
-            <w:t>0</w:t>
+            <w:t>1</w:t>
           </w:r>
         </w:p>
         <w:p>
@@ -3381,7 +3877,7 @@
               <w:sz w:val="16"/>
               <w:szCs w:val="16"/>
             </w:rPr>
-            <w:t>… / … / …</w:t>
+            <w:t>19.10.2026</w:t>
           </w:r>
         </w:p>
       </w:tc>

</xml_diff>

<commit_message>
Organik prosedür, talimat ve politika başlıklarına GOTS logosu eklendi
Co-Authored-By: Claude Sonnet 5.5 <noreply@anthropic.com>
Claude-Session: https://claude.ai/code/session_01J6foNXTwf1dGzDjULYpfrk
</commit_message>
<xml_diff>
--- a/prosedurler/EMS.OR.POL.21.01. Organic Content Policy.docx
+++ b/prosedurler/EMS.OR.POL.21.01. Organic Content Policy.docx
@@ -3525,8 +3525,8 @@
       <w:tblLook w:val="04A0" w:firstRow="1" w:lastRow="0" w:firstColumn="1" w:lastColumn="0" w:noHBand="0" w:noVBand="1"/>
     </w:tblPr>
     <w:tblGrid>
-      <w:gridCol w:w="2519"/>
-      <w:gridCol w:w="4728"/>
+      <w:gridCol w:w="2969"/>
+      <w:gridCol w:w="4278"/>
       <w:gridCol w:w="1320"/>
       <w:gridCol w:w="1709"/>
     </w:tblGrid>
@@ -3536,7 +3536,7 @@
       </w:trPr>
       <w:tc>
         <w:tcPr>
-          <w:tcW w:w="2519" w:type="dxa"/>
+          <w:tcW w:w="2969" w:type="dxa"/>
           <w:tcBorders>
             <w:top w:val="single" w:sz="4" w:space="0" w:color="auto"/>
             <w:left w:val="single" w:sz="4" w:space="0" w:color="auto"/>
@@ -3565,7 +3565,7 @@
             </w:rPr>
             <w:drawing>
               <wp:inline distT="0" distB="0" distL="0" distR="0" wp14:anchorId="151A8098" wp14:editId="34C3FA3F">
-                <wp:extent cx="723900" cy="631163"/>
+                <wp:extent cx="760000" cy="662638"/>
                 <wp:effectExtent l="0" t="0" r="0" b="0"/>
                 <wp:docPr id="38064677" name="Picture 2"/>
                 <wp:cNvGraphicFramePr>
@@ -3596,7 +3596,7 @@
                       <pic:spPr bwMode="auto">
                         <a:xfrm>
                           <a:off x="0" y="0"/>
-                          <a:ext cx="750578" cy="654423"/>
+                          <a:ext cx="788008" cy="687058"/>
                         </a:xfrm>
                         <a:prstGeom prst="rect">
                           <a:avLst/>
@@ -3617,11 +3617,46 @@
               </wp:inline>
             </w:drawing>
           </w:r>
+          <w:r>
+            <w:t xml:space="preserve"> </w:t>
+            <w:drawing>
+              <wp:inline xmlns:a="http://schemas.openxmlformats.org/drawingml/2006/main" xmlns:pic="http://schemas.openxmlformats.org/drawingml/2006/picture">
+                <wp:extent cx="700000" cy="700000"/>
+                <wp:docPr id="38064678" name="Picture 38064678"/>
+                <wp:cNvGraphicFramePr>
+                  <a:graphicFrameLocks noChangeAspect="1"/>
+                </wp:cNvGraphicFramePr>
+                <a:graphic>
+                  <a:graphicData uri="http://schemas.openxmlformats.org/drawingml/2006/picture">
+                    <pic:pic>
+                      <pic:nvPicPr>
+                        <pic:cNvPr id="0" name="gots_hd_kare.png"/>
+                        <pic:cNvPicPr/>
+                      </pic:nvPicPr>
+                      <pic:blipFill>
+                        <a:blip r:embed="rId2"/>
+                        <a:stretch>
+                          <a:fillRect/>
+                        </a:stretch>
+                      </pic:blipFill>
+                      <pic:spPr>
+                        <a:xfrm>
+                          <a:off x="0" y="0"/>
+                          <a:ext cx="700000" cy="700000"/>
+                        </a:xfrm>
+                        <a:prstGeom prst="rect"/>
+                      </pic:spPr>
+                    </pic:pic>
+                  </a:graphicData>
+                </a:graphic>
+              </wp:inline>
+            </w:drawing>
+          </w:r>
         </w:p>
       </w:tc>
       <w:tc>
         <w:tcPr>
-          <w:tcW w:w="4728" w:type="dxa"/>
+          <w:tcW w:w="4278" w:type="dxa"/>
           <w:tcBorders>
             <w:top w:val="single" w:sz="4" w:space="0" w:color="auto"/>
             <w:left w:val="single" w:sz="4" w:space="0" w:color="auto"/>

</xml_diff>

<commit_message>
Organik prosedür, talimat ve politika başlıklarına GOTS logosu eklendi (#463)
Claude-Session: https://claude.ai/code/session_01J6foNXTwf1dGzDjULYpfrk

Co-authored-by: Claude <noreply@anthropic.com>
</commit_message>
<xml_diff>
--- a/prosedurler/EMS.OR.POL.21.01. Organic Content Policy.docx
+++ b/prosedurler/EMS.OR.POL.21.01. Organic Content Policy.docx
@@ -3525,8 +3525,8 @@
       <w:tblLook w:val="04A0" w:firstRow="1" w:lastRow="0" w:firstColumn="1" w:lastColumn="0" w:noHBand="0" w:noVBand="1"/>
     </w:tblPr>
     <w:tblGrid>
-      <w:gridCol w:w="2519"/>
-      <w:gridCol w:w="4728"/>
+      <w:gridCol w:w="2969"/>
+      <w:gridCol w:w="4278"/>
       <w:gridCol w:w="1320"/>
       <w:gridCol w:w="1709"/>
     </w:tblGrid>
@@ -3536,7 +3536,7 @@
       </w:trPr>
       <w:tc>
         <w:tcPr>
-          <w:tcW w:w="2519" w:type="dxa"/>
+          <w:tcW w:w="2969" w:type="dxa"/>
           <w:tcBorders>
             <w:top w:val="single" w:sz="4" w:space="0" w:color="auto"/>
             <w:left w:val="single" w:sz="4" w:space="0" w:color="auto"/>
@@ -3565,7 +3565,7 @@
             </w:rPr>
             <w:drawing>
               <wp:inline distT="0" distB="0" distL="0" distR="0" wp14:anchorId="151A8098" wp14:editId="34C3FA3F">
-                <wp:extent cx="723900" cy="631163"/>
+                <wp:extent cx="760000" cy="662638"/>
                 <wp:effectExtent l="0" t="0" r="0" b="0"/>
                 <wp:docPr id="38064677" name="Picture 2"/>
                 <wp:cNvGraphicFramePr>
@@ -3596,7 +3596,7 @@
                       <pic:spPr bwMode="auto">
                         <a:xfrm>
                           <a:off x="0" y="0"/>
-                          <a:ext cx="750578" cy="654423"/>
+                          <a:ext cx="788008" cy="687058"/>
                         </a:xfrm>
                         <a:prstGeom prst="rect">
                           <a:avLst/>
@@ -3617,11 +3617,46 @@
               </wp:inline>
             </w:drawing>
           </w:r>
+          <w:r>
+            <w:t xml:space="preserve"> </w:t>
+            <w:drawing>
+              <wp:inline xmlns:a="http://schemas.openxmlformats.org/drawingml/2006/main" xmlns:pic="http://schemas.openxmlformats.org/drawingml/2006/picture">
+                <wp:extent cx="700000" cy="700000"/>
+                <wp:docPr id="38064678" name="Picture 38064678"/>
+                <wp:cNvGraphicFramePr>
+                  <a:graphicFrameLocks noChangeAspect="1"/>
+                </wp:cNvGraphicFramePr>
+                <a:graphic>
+                  <a:graphicData uri="http://schemas.openxmlformats.org/drawingml/2006/picture">
+                    <pic:pic>
+                      <pic:nvPicPr>
+                        <pic:cNvPr id="0" name="gots_hd_kare.png"/>
+                        <pic:cNvPicPr/>
+                      </pic:nvPicPr>
+                      <pic:blipFill>
+                        <a:blip r:embed="rId2"/>
+                        <a:stretch>
+                          <a:fillRect/>
+                        </a:stretch>
+                      </pic:blipFill>
+                      <pic:spPr>
+                        <a:xfrm>
+                          <a:off x="0" y="0"/>
+                          <a:ext cx="700000" cy="700000"/>
+                        </a:xfrm>
+                        <a:prstGeom prst="rect"/>
+                      </pic:spPr>
+                    </pic:pic>
+                  </a:graphicData>
+                </a:graphic>
+              </wp:inline>
+            </w:drawing>
+          </w:r>
         </w:p>
       </w:tc>
       <w:tc>
         <w:tcPr>
-          <w:tcW w:w="4728" w:type="dxa"/>
+          <w:tcW w:w="4278" w:type="dxa"/>
           <w:tcBorders>
             <w:top w:val="single" w:sz="4" w:space="0" w:color="auto"/>
             <w:left w:val="single" w:sz="4" w:space="0" w:color="auto"/>

</xml_diff>